<commit_message>
Try fixing create-pdf-images script bug
</commit_message>
<xml_diff>
--- a/public/data/common-side-effects/common-side-effects.docx
+++ b/public/data/common-side-effects/common-side-effects.docx
@@ -1685,7 +1685,7 @@
     <w:p>
       <w:pPr>
         <w:pStyle w:val="ParagraphNormal"/>
-        <w:spacing w:before="200" w:after="200"/>
+        <w:spacing w:before="200"/>
       </w:pPr>
       <w:r>
         <w:rPr>
@@ -2945,7 +2945,7 @@
           <w:sz w:val="16"/>
           <w:szCs w:val="16"/>
         </w:rPr>
-        <w:t xml:space="preserve"> increment the clock. </w:t>
+        <w:t xml:space="preserve"> increment the clock</w:t>
       </w:r>
     </w:p>
     <w:tbl>
@@ -3620,6 +3620,9 @@
                     <w:t>(</w:t>
                   </w:r>
                   <w:r>
+                    <w:rPr>
+                      <w:noProof/>
+                    </w:rPr>
                     <w:drawing>
                       <wp:inline distT="0" distB="0" distL="0" distR="0" wp14:anchorId="3491BFDA" wp14:editId="5679DDB1">
                         <wp:extent cx="91793" cy="91793"/>
@@ -3670,13 +3673,7 @@
                     </w:drawing>
                   </w:r>
                   <w:r>
-                    <w:t xml:space="preserve"> </w:t>
-                  </w:r>
-                  <w:r>
-                    <w:t>6</w:t>
-                  </w:r>
-                  <w:r>
-                    <w:t>)</w:t>
+                    <w:t xml:space="preserve"> 6)</w:t>
                   </w:r>
                 </w:p>
                 <w:p>
@@ -3758,6 +3755,7 @@
                   <w:r>
                     <w:rPr>
                       <w:rStyle w:val="NoParagraphNormalChar"/>
+                      <w:noProof/>
                     </w:rPr>
                     <w:drawing>
                       <wp:inline distT="0" distB="0" distL="0" distR="0" wp14:anchorId="4C8A69FC" wp14:editId="7510BF76">
@@ -3812,19 +3810,7 @@
                     <w:rPr>
                       <w:rStyle w:val="NoParagraphNormalChar"/>
                     </w:rPr>
-                    <w:t xml:space="preserve"> </w:t>
-                  </w:r>
-                  <w:r>
-                    <w:rPr>
-                      <w:rStyle w:val="NoParagraphNormalChar"/>
-                    </w:rPr>
-                    <w:t>4</w:t>
-                  </w:r>
-                  <w:r>
-                    <w:rPr>
-                      <w:rStyle w:val="NoParagraphNormalChar"/>
-                    </w:rPr>
-                    <w:t>)</w:t>
+                    <w:t xml:space="preserve"> 4)</w:t>
                   </w:r>
                 </w:p>
                 <w:p>
@@ -3946,10 +3932,7 @@
         <w:t>very</w:t>
       </w:r>
       <w:r>
-        <w:t xml:space="preserve"> pleased with your work</w:t>
-      </w:r>
-      <w:r>
-        <w:t xml:space="preserve">! </w:t>
+        <w:t xml:space="preserve"> pleased with your work! </w:t>
       </w:r>
       <w:r>
         <w:t>I heard about what happened at Golden Harvest</w:t>
@@ -4804,6 +4787,7 @@
   <w:style w:type="character" w:default="1" w:styleId="DefaultParagraphFont">
     <w:name w:val="Default Paragraph Font"/>
     <w:uiPriority w:val="1"/>
+    <w:semiHidden/>
     <w:unhideWhenUsed/>
   </w:style>
   <w:style w:type="table" w:default="1" w:styleId="TableNormal">

</xml_diff>

<commit_message>
Change resourece clock to supply clock
</commit_message>
<xml_diff>
--- a/public/data/common-side-effects/common-side-effects.docx
+++ b/public/data/common-side-effects/common-side-effects.docx
@@ -2843,7 +2843,14 @@
           <w:sz w:val="16"/>
           <w:szCs w:val="16"/>
         </w:rPr>
-        <w:t xml:space="preserve">Player creates </w:t>
+        <w:t>Make</w:t>
+      </w:r>
+      <w:r>
+        <w:rPr>
+          <w:sz w:val="16"/>
+          <w:szCs w:val="16"/>
+        </w:rPr>
+        <w:t xml:space="preserve"> </w:t>
       </w:r>
       <w:r>
         <w:rPr>
@@ -2857,7 +2864,7 @@
           <w:sz w:val="16"/>
           <w:szCs w:val="16"/>
         </w:rPr>
-        <w:t>resource</w:t>
+        <w:t>supply</w:t>
       </w:r>
       <w:r>
         <w:rPr>
@@ -2931,21 +2938,42 @@
           <w:sz w:val="16"/>
           <w:szCs w:val="16"/>
         </w:rPr>
-        <w:t>Each time the resource is used,</w:t>
+        <w:t xml:space="preserve">For more information on </w:t>
       </w:r>
       <w:r>
         <w:rPr>
           <w:sz w:val="16"/>
           <w:szCs w:val="16"/>
         </w:rPr>
-        <w:t xml:space="preserve"> they</w:t>
+        <w:t xml:space="preserve">supply </w:t>
       </w:r>
       <w:r>
         <w:rPr>
           <w:sz w:val="16"/>
           <w:szCs w:val="16"/>
         </w:rPr>
-        <w:t xml:space="preserve"> increment the clock</w:t>
+        <w:t xml:space="preserve">clocks, check p. </w:t>
+      </w:r>
+      <w:r>
+        <w:rPr>
+          <w:sz w:val="16"/>
+          <w:szCs w:val="16"/>
+        </w:rPr>
+        <w:t>86</w:t>
+      </w:r>
+      <w:r>
+        <w:rPr>
+          <w:sz w:val="16"/>
+          <w:szCs w:val="16"/>
+        </w:rPr>
+        <w:t xml:space="preserve"> of </w:t>
+      </w:r>
+      <w:r>
+        <w:rPr>
+          <w:sz w:val="16"/>
+          <w:szCs w:val="16"/>
+        </w:rPr>
+        <w:t>Deep Cuts</w:t>
       </w:r>
     </w:p>
     <w:tbl>
@@ -4787,7 +4815,6 @@
   <w:style w:type="character" w:default="1" w:styleId="DefaultParagraphFont">
     <w:name w:val="Default Paragraph Font"/>
     <w:uiPriority w:val="1"/>
-    <w:semiHidden/>
     <w:unhideWhenUsed/>
   </w:style>
   <w:style w:type="table" w:default="1" w:styleId="TableNormal">

</xml_diff>